<commit_message>
docs: update Word and HTML provenance for release 0.3.2
Add the pinned MIDRC baseline and release/tag history to the standalone documents. Align documentation labels, publication status, checksums and generated references; retain schema revision 0.3.0-proposal.
</commit_message>
<xml_diff>
--- a/extensions/lu177_psma/v0.3.0/NMMI_Lu177_PSMA_Architecture_and_Status.docx
+++ b/extensions/lu177_psma/v0.3.0/NMMI_Lu177_PSMA_Architecture_and_Status.docx
@@ -26,7 +26,9 @@
     </w:p>
     <w:p>
       <w:r>
-        <w:t>Version 0.3.0 proposal    16 October 2026</w:t>
+        <w:t>Documentation release 0.3.2    19 October 2026</w:t>
+        <w:br/>
+        <w:t>Model schema revision 0.3.0-proposal</w:t>
       </w:r>
     </w:p>
     <w:p>
@@ -46,7 +48,7 @@
     </w:p>
     <w:p>
       <w:r>
-        <w:t>This revision makes the proposed model an additive extension of the deployed MIDRC dictionary. It reuses MIDRC record types and property definitions for images, measurements, observations and annotations, while preserving the theranostics course, cycle, dose, safety and outcome relationships. Graph views, table views and JSON schemas are generated from the same structure.</w:t>
+        <w:t>The proposed model is an additive extension of the deployed MIDRC dictionary. It reuses MIDRC record types and property definitions for images, measurements, observations and annotations, while preserving the theranostics course, cycle, dose, safety and outcome relationships. Graph views, table views and JSON schemas are generated from the same structure.</w:t>
       </w:r>
     </w:p>
     <w:tbl>
@@ -1396,7 +1398,7 @@
     </w:p>
     <w:p>
       <w:r>
-        <w:t>The baseline is the deployed MIDRC dictionary retrieved on 16 October 2026: version 1.4.3-2-g7505333, commit 7505333d56c87a289463a814131e38d0f2be6674. The complete snapshot, SHA-256, original uploaded templates and change audit are included. Existing node metadata, required lists, types, definitions, relationship multiplicities and subgroup rules are preserved. [2, 3]</w:t>
+        <w:t>Lu177-PSMA theranostics data model release 0.3.0 extends the deployed MIDRC Gen3 dictionary version 1.4.3-2-g7505333, commit 7505333d56c87a289463a814131e38d0f2be6674, retrieved on 16 October 2026. The baseline snapshot and its SHA-256 checksum are preserved in this release. Existing node metadata, required lists, types, definitions, relationship multiplicities and subgroup rules are preserved. [2, 3]</w:t>
       </w:r>
     </w:p>
     <w:tbl>
@@ -6653,7 +6655,9 @@
         <w:rPr>
           <w:sz w:val="18"/>
         </w:rPr>
-        <w:t>Example paths: pt_series_file.imaging_studies; nm_series_file.imaging_studies; imaging_study.administrations</w:t>
+        <w:t>Example paths: pt_series_file.imaging_studies; nm_series_file.imaging_studies;</w:t>
+        <w:br/>
+        <w:t>imaging_study.administrations</w:t>
       </w:r>
     </w:p>
     <w:p>
@@ -7341,7 +7345,7 @@
     <w:p/>
     <w:p>
       <w:r>
-        <w:t>The merged _settings retains the original MIDRC baseline provenance. The extension version is recorded separately in release_manifest.json. The receiving build must assign its own dictionary version and commit; the baseline commit must not be presented as the commit of a new deployed release.</w:t>
+        <w:t>The merged _settings retains the original MIDRC baseline provenance. The model schema revision remains 0.3.0-proposal in release_manifest.json; repository and document release 0.3.2 are recorded separately in the root release.json and documentation metadata. The receiving build must assign its own dictionary version and commit; the baseline commit must not be presented as the commit of a new deployed release.</w:t>
       </w:r>
     </w:p>
     <w:p>
@@ -8655,7 +8659,7 @@
                 <w:color w:val="172A3A"/>
                 <w:sz w:val="21"/>
               </w:rPr>
-              <w:t>The team has described a working GitHub release in November and a journal publication goal by end 2026; these are intentions, not completed milestones.</w:t>
+              <w:t>The initial GitHub release 0.3.0 was published on 16 October 2026. Documentation release 0.3.2 accompanies this document. Journal publication by the end of 2026 remains an aim.</w:t>
             </w:r>
           </w:p>
         </w:tc>
@@ -8877,6 +8881,106 @@
         <w:t>MIDRC schema content is reused under Apache License 2.0. The license, source attribution and modification notice accompany the package. LOINC and the external ontologies retain their own governance and terms. Gen3/MIDRC interface and terminology references were checked for this revision on 16 October 2026; clinical source reviews carried forward from version 0.2 remain identified in the review log.</w:t>
       </w:r>
     </w:p>
+    <w:p>
+      <w:pPr>
+        <w:pStyle w:val="Heading1"/>
+        <w:pageBreakBefore/>
+      </w:pPr>
+      <w:r>
+        <w:t>Release history and baseline provenance</w:t>
+      </w:r>
+    </w:p>
+    <w:p>
+      <w:r>
+        <w:t>This document accompanies repository release 0.3.2. The model schema revision remains 0.3.0-proposal, and the model files continue to reside under extensions/lu177_psma/v0.3.0/. Documentation revisions do not change the 67 node types, 293 relationships or field definitions.</w:t>
+      </w:r>
+    </w:p>
+    <w:p>
+      <w:r>
+        <w:t>Lu177-PSMA theranostics data model release 0.3.0 extends the deployed MIDRC Gen3 dictionary version 1.4.3-2-g7505333, commit 7505333d56c87a289463a814131e38d0f2be6674, retrieved on 16 October 2026. The baseline snapshot and its SHA-256 checksum are preserved in this release.</w:t>
+      </w:r>
+    </w:p>
+    <w:p>
+      <w:pPr>
+        <w:pStyle w:val="Heading2"/>
+      </w:pPr>
+      <w:r>
+        <w:t>Release chronology</w:t>
+      </w:r>
+    </w:p>
+    <w:p>
+      <w:r>
+        <w:rPr>
+          <w:b/>
+        </w:rPr>
+        <w:t xml:space="preserve">Release 0.3.0 | 16 October 2026. </w:t>
+      </w:r>
+      <w:r>
+        <w:t>Initial theranostics model release, tagged v0.3.0.</w:t>
+      </w:r>
+    </w:p>
+    <w:p>
+      <w:r>
+        <w:rPr>
+          <w:b/>
+        </w:rPr>
+        <w:t xml:space="preserve">Release 0.3.1 | 19 October 2026. </w:t>
+      </w:r>
+      <w:r>
+        <w:t>Repository documentation patch identifying the precise MIDRC baseline and correcting inherited-tag wording.</w:t>
+      </w:r>
+    </w:p>
+    <w:p>
+      <w:r>
+        <w:rPr>
+          <w:b/>
+        </w:rPr>
+        <w:t xml:space="preserve">Release 0.3.2 | 19 October 2026. </w:t>
+      </w:r>
+      <w:r>
+        <w:t>Word and HTML documentation update with matching release labels, baseline provenance and release history. The model schemas are unchanged.</w:t>
+      </w:r>
+    </w:p>
+    <w:p>
+      <w:r>
+        <w:t>The initial theranostics model release is tagged v0.3.0. Inherited MIDRC tags have been removed from this repository. Documentation patches use v0.3.1 and v0.3.2; earlier release tags and their original downloads remain unchanged.</w:t>
+      </w:r>
+    </w:p>
+    <w:p>
+      <w:pPr>
+        <w:pStyle w:val="Heading2"/>
+      </w:pPr>
+      <w:r>
+        <w:t>Reproducible baseline</w:t>
+      </w:r>
+    </w:p>
+    <w:p>
+      <w:r>
+        <w:t>Source: https://data.midrc.org/api/v0/submission/_dictionary/_all</w:t>
+      </w:r>
+    </w:p>
+    <w:p>
+      <w:r>
+        <w:t>Snapshot: sources/midrc_dictionary_1.4.3-2-g7505333.json</w:t>
+      </w:r>
+    </w:p>
+    <w:p>
+      <w:r>
+        <w:t xml:space="preserve">Snapshot SHA-256: </w:t>
+      </w:r>
+      <w:r>
+        <w:rPr>
+          <w:rFonts w:ascii="Consolas" w:hAnsi="Consolas"/>
+          <w:sz w:val="17"/>
+        </w:rPr>
+        <w:t>578e57dc45f719b07f1ac31482fed9129675c133aaafc3004dc346e5e4928e21</w:t>
+      </w:r>
+    </w:p>
+    <w:p>
+      <w:r>
+        <w:t>The retained gdcdictionary/ source comes from repository parent bee947238381704486ccd12beeb8f4689fb22843. It is a different revision from the pinned deployed dictionary and must be reconciled before live integration.</w:t>
+      </w:r>
+    </w:p>
     <w:sectPr>
       <w:footerReference w:type="default" r:id="rId19"/>
       <w:pgSz w:w="12240" w:h="15840"/>
@@ -8924,7 +9028,7 @@
       <w:rPr>
         <w:sz w:val="16"/>
       </w:rPr>
-      <w:t xml:space="preserve">NMMI model 0.3.0 proposal  |  </w:t>
+      <w:t xml:space="preserve">NMMI documentation 0.3.2  |  </w:t>
     </w:r>
     <w:r>
       <w:fldChar w:fldCharType="begin"/>

</xml_diff>